<commit_message>
docs(desweb): Atualiza o relatorio da techstore
</commit_message>
<xml_diff>
--- a/Semestre2/desweb/React/Techstore/Relatorio_Conceitos_TechStore.docx
+++ b/Semestre2/desweb/React/Techstore/Relatorio_Conceitos_TechStore.docx
@@ -1,17 +1,67 @@
 
 <file path=word/document.xml><?xml version="1.0" encoding="utf-8"?>
-<w:document xmlns:wpc="http://schemas.microsoft.com/office/word/2010/wordprocessingCanvas" xmlns:mo="http://schemas.microsoft.com/office/mac/office/2008/main" xmlns:mc="http://schemas.openxmlformats.org/markup-compatibility/2006" xmlns:mv="urn:schemas-microsoft-com:mac:vml" xmlns:o="urn:schemas-microsoft-com:office:office" xmlns:r="http://schemas.openxmlformats.org/officeDocument/2006/relationships" xmlns:m="http://schemas.openxmlformats.org/officeDocument/2006/math" xmlns:v="urn:schemas-microsoft-com:vml" xmlns:wp14="http://schemas.microsoft.com/office/word/2010/wordprocessingDrawing" xmlns:wp="http://schemas.openxmlformats.org/drawingml/2006/wordprocessingDrawing" xmlns:w10="urn:schemas-microsoft-com:office:word" xmlns:w="http://schemas.openxmlformats.org/wordprocessingml/2006/main" xmlns:w14="http://schemas.microsoft.com/office/word/2010/wordml" xmlns:wpg="http://schemas.microsoft.com/office/word/2010/wordprocessingGroup" xmlns:wpi="http://schemas.microsoft.com/office/word/2010/wordprocessingInk" xmlns:wne="http://schemas.microsoft.com/office/word/2006/wordml" xmlns:wps="http://schemas.microsoft.com/office/word/2010/wordprocessingShape" mc:Ignorable="w14 wp14">
+<w:document xmlns:wpc="http://schemas.microsoft.com/office/word/2010/wordprocessingCanvas" xmlns:mc="http://schemas.openxmlformats.org/markup-compatibility/2006" xmlns:o="urn:schemas-microsoft-com:office:office" xmlns:r="http://schemas.openxmlformats.org/officeDocument/2006/relationships" xmlns:m="http://schemas.openxmlformats.org/officeDocument/2006/math" xmlns:v="urn:schemas-microsoft-com:vml" xmlns:wp14="http://schemas.microsoft.com/office/word/2010/wordprocessingDrawing" xmlns:wp="http://schemas.openxmlformats.org/drawingml/2006/wordprocessingDrawing" xmlns:w10="urn:schemas-microsoft-com:office:word" xmlns:w="http://schemas.openxmlformats.org/wordprocessingml/2006/main" xmlns:w14="http://schemas.microsoft.com/office/word/2010/wordml" xmlns:w15="http://schemas.microsoft.com/office/word/2012/wordml" xmlns:w16se="http://schemas.microsoft.com/office/word/2015/wordml/symex" xmlns:w16cid="http://schemas.microsoft.com/office/word/2016/wordml/cid" xmlns:w16="http://schemas.microsoft.com/office/word/2018/wordml" xmlns:w16cex="http://schemas.microsoft.com/office/word/2018/wordml/cex" xmlns:w16sdtdh="http://schemas.microsoft.com/office/word/2020/wordml/sdtdatahash" xmlns:wne="http://schemas.microsoft.com/office/word/2006/wordml" xmlns:wpg="http://schemas.microsoft.com/office/word/2010/wordprocessingGroup" xmlns:wps="http://schemas.microsoft.com/office/word/2010/wordprocessingShape" mc:Ignorable="w14 w15 w16se w16cid w16 w16cex w16sdtdh wp14">
   <w:body>
     <w:p>
       <w:pPr>
         <w:spacing w:after="80"/>
       </w:pPr>
       <w:r>
+        <w:t xml:space="preserve">  </w:t>
+      </w:r>
+    </w:p>
+    <w:p>
+      <w:pPr>
+        <w:spacing w:after="80" w:line="276" w:lineRule="auto"/>
+      </w:pPr>
+      <w:r>
         <w:rPr>
-          <w:rFonts w:ascii="Arial" w:hAnsi="Arial"/>
+          <w:rFonts w:ascii="Arial" w:cs="Arial"/>
           <w:b/>
+          <w:bCs/>
+          <w:sz w:val="32"/>
+          <w:szCs w:val="32"/>
+        </w:rPr>
+        <w:t>Ryan Dias da Silva</w:t>
+      </w:r>
+    </w:p>
+    <w:p>
+      <w:pPr>
+        <w:spacing w:after="80" w:line="276" w:lineRule="auto"/>
+      </w:pPr>
+      <w:r>
+        <w:rPr>
+          <w:rFonts w:ascii="Arial" w:cs="Arial"/>
+          <w:b/>
+          <w:bCs/>
+          <w:sz w:val="32"/>
+          <w:szCs w:val="32"/>
+        </w:rPr>
+        <w:t>Murilo Paes Sobrinho</w:t>
+      </w:r>
+    </w:p>
+    <w:p>
+      <w:r>
+        <w:t xml:space="preserve">  </w:t>
+      </w:r>
+    </w:p>
+    <w:p>
+      <w:pPr>
+        <w:spacing w:after="80"/>
+      </w:pPr>
+    </w:p>
+    <w:p>
+      <w:pPr>
+        <w:spacing w:after="80"/>
+      </w:pPr>
+      <w:r>
+        <w:rPr>
+          <w:rFonts w:ascii="Arial" w:hAnsi="Arial" w:eastAsia="ＭＳ 明朝" w:cs="Arial" w:eastAsiaTheme="minorEastAsia" w:csTheme="minorBidi"/>
+          <w:b/>
+          <w:bCs/>
           <w:color w:val="111827"/>
           <w:sz w:val="40"/>
+          <w:szCs w:val="22"/>
         </w:rPr>
         <w:t>Relatório de Conceitos: Projeto TechStore</w:t>
       </w:r>
@@ -22,9 +72,10 @@
       </w:pPr>
       <w:r>
         <w:rPr>
-          <w:rFonts w:ascii="Arial" w:hAnsi="Arial"/>
+          <w:rFonts w:ascii="Arial" w:hAnsi="Arial" w:eastAsia="ＭＳ 明朝" w:cs="Arial" w:eastAsiaTheme="minorEastAsia" w:csTheme="minorBidi"/>
           <w:color w:val="6B7280"/>
           <w:sz w:val="22"/>
+          <w:szCs w:val="22"/>
         </w:rPr>
         <w:t>Desenvolvimento Web | React &amp; JavaScript</w:t>
       </w:r>
@@ -34,6 +85,11 @@
         <w:spacing w:after="280"/>
       </w:pPr>
       <w:r>
+        <w:rPr>
+          <w:rFonts w:ascii="Cambria" w:hAnsi="Cambria" w:eastAsia="ＭＳ 明朝" w:cs="Cambria" w:asciiTheme="minorHAnsi" w:hAnsiTheme="minorHAnsi" w:eastAsiaTheme="minorEastAsia" w:csTheme="minorBidi"/>
+          <w:sz w:val="22"/>
+          <w:szCs w:val="22"/>
+        </w:rPr>
         <w:t>Este documento apresenta de forma concisa e objetiva os principais conceitos de React e Desenvolvimento Web aplicados na construção da aplicação TechStore.</w:t>
       </w:r>
     </w:p>
@@ -43,10 +99,12 @@
       </w:pPr>
       <w:r>
         <w:rPr>
-          <w:rFonts w:ascii="Arial" w:hAnsi="Arial"/>
+          <w:rFonts w:ascii="Arial" w:hAnsi="Arial" w:eastAsia="ＭＳ 明朝" w:cs="Arial" w:eastAsiaTheme="minorEastAsia" w:csTheme="minorBidi"/>
           <w:b/>
+          <w:bCs/>
           <w:color w:val="0066CC"/>
           <w:sz w:val="26"/>
+          <w:szCs w:val="22"/>
         </w:rPr>
         <w:t>1. Componentização e Separação de Responsabilidades</w:t>
       </w:r>
@@ -56,20 +114,88 @@
         <w:spacing w:after="160"/>
       </w:pPr>
       <w:r>
+        <w:rPr>
+          <w:rFonts w:ascii="Cambria" w:hAnsi="Cambria" w:eastAsia="ＭＳ 明朝" w:cs="Cambria" w:asciiTheme="minorHAnsi" w:hAnsiTheme="minorHAnsi" w:eastAsiaTheme="minorEastAsia" w:csTheme="minorBidi"/>
+          <w:sz w:val="22"/>
+          <w:szCs w:val="22"/>
+        </w:rPr>
         <w:t>A interface foi decomposta em componentes modulares e reutilizáveis, garantindo organização e clareza:</w:t>
-        <w:br/>
+      </w:r>
+      <w:r>
+        <w:br w:type="textWrapping"/>
+      </w:r>
+      <w:r>
+        <w:rPr>
+          <w:rFonts w:ascii="Cambria" w:hAnsi="Cambria" w:eastAsia="ＭＳ 明朝" w:cs="Cambria" w:asciiTheme="minorHAnsi" w:hAnsiTheme="minorHAnsi" w:eastAsiaTheme="minorEastAsia" w:csTheme="minorBidi"/>
+          <w:sz w:val="22"/>
+          <w:szCs w:val="22"/>
+        </w:rPr>
         <w:t>• Header.jsx: Cabeçalho com logotipo e navegação.</w:t>
-        <w:br/>
+      </w:r>
+      <w:r>
+        <w:br w:type="textWrapping"/>
+      </w:r>
+      <w:r>
+        <w:rPr>
+          <w:rFonts w:ascii="Cambria" w:hAnsi="Cambria" w:eastAsia="ＭＳ 明朝" w:cs="Cambria" w:asciiTheme="minorHAnsi" w:hAnsiTheme="minorHAnsi" w:eastAsiaTheme="minorEastAsia" w:csTheme="minorBidi"/>
+          <w:sz w:val="22"/>
+          <w:szCs w:val="22"/>
+        </w:rPr>
         <w:t>• Hero.jsx: Banner visual de destaque.</w:t>
-        <w:br/>
+      </w:r>
+      <w:r>
+        <w:br w:type="textWrapping"/>
+      </w:r>
+      <w:r>
+        <w:rPr>
+          <w:rFonts w:ascii="Cambria" w:hAnsi="Cambria" w:eastAsia="ＭＳ 明朝" w:cs="Cambria" w:asciiTheme="minorHAnsi" w:hAnsiTheme="minorHAnsi" w:eastAsiaTheme="minorEastAsia" w:csTheme="minorBidi"/>
+          <w:sz w:val="22"/>
+          <w:szCs w:val="22"/>
+        </w:rPr>
         <w:t>• Category.jsx: Cartão reutilizável para cada categoria.</w:t>
-        <w:br/>
+      </w:r>
+      <w:r>
+        <w:br w:type="textWrapping"/>
+      </w:r>
+      <w:r>
+        <w:rPr>
+          <w:rFonts w:ascii="Cambria" w:hAnsi="Cambria" w:eastAsia="ＭＳ 明朝" w:cs="Cambria" w:asciiTheme="minorHAnsi" w:hAnsiTheme="minorHAnsi" w:eastAsiaTheme="minorEastAsia" w:csTheme="minorBidi"/>
+          <w:sz w:val="22"/>
+          <w:szCs w:val="22"/>
+        </w:rPr>
         <w:t>• ProductCard.jsx: Card padrão para apresentação de cada produto.</w:t>
-        <w:br/>
+      </w:r>
+      <w:r>
+        <w:br w:type="textWrapping"/>
+      </w:r>
+      <w:r>
+        <w:rPr>
+          <w:rFonts w:ascii="Cambria" w:hAnsi="Cambria" w:eastAsia="ＭＳ 明朝" w:cs="Cambria" w:asciiTheme="minorHAnsi" w:hAnsiTheme="minorHAnsi" w:eastAsiaTheme="minorEastAsia" w:csTheme="minorBidi"/>
+          <w:sz w:val="22"/>
+          <w:szCs w:val="22"/>
+        </w:rPr>
         <w:t>• Cart.jsx: Seção lateral de itens adicionados ao carrinho.</w:t>
-        <w:br/>
+      </w:r>
+      <w:r>
+        <w:br w:type="textWrapping"/>
+      </w:r>
+      <w:r>
+        <w:rPr>
+          <w:rFonts w:ascii="Cambria" w:hAnsi="Cambria" w:eastAsia="ＭＳ 明朝" w:cs="Cambria" w:asciiTheme="minorHAnsi" w:hAnsiTheme="minorHAnsi" w:eastAsiaTheme="minorEastAsia" w:csTheme="minorBidi"/>
+          <w:sz w:val="22"/>
+          <w:szCs w:val="22"/>
+        </w:rPr>
         <w:t>• Footer.jsx: Rodapé informativo do sistema.</w:t>
-        <w:br/>
+      </w:r>
+      <w:r>
+        <w:br w:type="textWrapping"/>
+      </w:r>
+      <w:r>
+        <w:rPr>
+          <w:rFonts w:ascii="Cambria" w:hAnsi="Cambria" w:eastAsia="ＭＳ 明朝" w:cs="Cambria" w:asciiTheme="minorHAnsi" w:hAnsiTheme="minorHAnsi" w:eastAsiaTheme="minorEastAsia" w:csTheme="minorBidi"/>
+          <w:sz w:val="22"/>
+          <w:szCs w:val="22"/>
+        </w:rPr>
         <w:t>• App.jsx: Componente principal que coordena o estado global e compõe a página.</w:t>
       </w:r>
     </w:p>
@@ -79,10 +205,12 @@
       </w:pPr>
       <w:r>
         <w:rPr>
-          <w:rFonts w:ascii="Arial" w:hAnsi="Arial"/>
+          <w:rFonts w:ascii="Arial" w:hAnsi="Arial" w:eastAsia="ＭＳ 明朝" w:cs="Arial" w:eastAsiaTheme="minorEastAsia" w:csTheme="minorBidi"/>
           <w:b/>
+          <w:bCs/>
           <w:color w:val="0066CC"/>
           <w:sz w:val="26"/>
+          <w:szCs w:val="22"/>
         </w:rPr>
         <w:t>2. Props e Desestruturação</w:t>
       </w:r>
@@ -92,6 +220,11 @@
         <w:spacing w:after="160"/>
       </w:pPr>
       <w:r>
+        <w:rPr>
+          <w:rFonts w:ascii="Cambria" w:hAnsi="Cambria" w:eastAsia="ＭＳ 明朝" w:cs="Cambria" w:asciiTheme="minorHAnsi" w:hAnsiTheme="minorHAnsi" w:eastAsiaTheme="minorEastAsia" w:csTheme="minorBidi"/>
+          <w:sz w:val="22"/>
+          <w:szCs w:val="22"/>
+        </w:rPr>
         <w:t>As Props viabilizam o envio de informações de componentes pais para filhos (dados, imagens e textos). A desestruturação ({ nome, preco, imagem }) simplifica o acesso direto às propriedades recebidas nos parâmetros da função.</w:t>
       </w:r>
     </w:p>
@@ -101,10 +234,12 @@
       </w:pPr>
       <w:r>
         <w:rPr>
-          <w:rFonts w:ascii="Arial" w:hAnsi="Arial"/>
+          <w:rFonts w:ascii="Arial" w:hAnsi="Arial" w:eastAsia="ＭＳ 明朝" w:cs="Arial" w:eastAsiaTheme="minorEastAsia" w:csTheme="minorBidi"/>
           <w:b/>
+          <w:bCs/>
           <w:color w:val="0066CC"/>
           <w:sz w:val="26"/>
+          <w:szCs w:val="22"/>
         </w:rPr>
         <w:t>3. Renderização de Listas com .map() e key</w:t>
       </w:r>
@@ -114,6 +249,11 @@
         <w:spacing w:after="160"/>
       </w:pPr>
       <w:r>
+        <w:rPr>
+          <w:rFonts w:ascii="Cambria" w:hAnsi="Cambria" w:eastAsia="ＭＳ 明朝" w:cs="Cambria" w:asciiTheme="minorHAnsi" w:hAnsiTheme="minorHAnsi" w:eastAsiaTheme="minorEastAsia" w:csTheme="minorBidi"/>
+          <w:sz w:val="22"/>
+          <w:szCs w:val="22"/>
+        </w:rPr>
         <w:t>A renderização dinâmica a partir de arrays foi implementada através do método Array.map(). O atributo único 'key' permite ao React gerenciar a reconciliação do DOM com alta performance.</w:t>
       </w:r>
     </w:p>
@@ -123,10 +263,12 @@
       </w:pPr>
       <w:r>
         <w:rPr>
-          <w:rFonts w:ascii="Arial" w:hAnsi="Arial"/>
+          <w:rFonts w:ascii="Arial" w:hAnsi="Arial" w:eastAsia="ＭＳ 明朝" w:cs="Arial" w:eastAsiaTheme="minorEastAsia" w:csTheme="minorBidi"/>
           <w:b/>
+          <w:bCs/>
           <w:color w:val="0066CC"/>
           <w:sz w:val="26"/>
+          <w:szCs w:val="22"/>
         </w:rPr>
         <w:t>4. Gerenciamento de Estado com useState</w:t>
       </w:r>
@@ -136,10 +278,33 @@
         <w:spacing w:after="160"/>
       </w:pPr>
       <w:r>
+        <w:rPr>
+          <w:rFonts w:ascii="Cambria" w:hAnsi="Cambria" w:eastAsia="ＭＳ 明朝" w:cs="Cambria" w:asciiTheme="minorHAnsi" w:hAnsiTheme="minorHAnsi" w:eastAsiaTheme="minorEastAsia" w:csTheme="minorBidi"/>
+          <w:sz w:val="22"/>
+          <w:szCs w:val="22"/>
+        </w:rPr>
         <w:t>O Hook useState foi aplicado para gerenciar variáveis reativas que atualizam a interface automaticamente quando alteradas:</w:t>
-        <w:br/>
+      </w:r>
+      <w:r>
+        <w:br w:type="textWrapping"/>
+      </w:r>
+      <w:r>
+        <w:rPr>
+          <w:rFonts w:ascii="Cambria" w:hAnsi="Cambria" w:eastAsia="ＭＳ 明朝" w:cs="Cambria" w:asciiTheme="minorHAnsi" w:hAnsiTheme="minorHAnsi" w:eastAsiaTheme="minorEastAsia" w:csTheme="minorBidi"/>
+          <w:sz w:val="22"/>
+          <w:szCs w:val="22"/>
+        </w:rPr>
         <w:t>• categoria: controla a categoria selecionada para filtragem.</w:t>
-        <w:br/>
+      </w:r>
+      <w:r>
+        <w:br w:type="textWrapping"/>
+      </w:r>
+      <w:r>
+        <w:rPr>
+          <w:rFonts w:ascii="Cambria" w:hAnsi="Cambria" w:eastAsia="ＭＳ 明朝" w:cs="Cambria" w:asciiTheme="minorHAnsi" w:hAnsiTheme="minorHAnsi" w:eastAsiaTheme="minorEastAsia" w:csTheme="minorBidi"/>
+          <w:sz w:val="22"/>
+          <w:szCs w:val="22"/>
+        </w:rPr>
         <w:t>• carrinho: armazena a lista dinâmica de produtos escolhidos pelo usuário.</w:t>
       </w:r>
     </w:p>
@@ -149,10 +314,12 @@
       </w:pPr>
       <w:r>
         <w:rPr>
-          <w:rFonts w:ascii="Arial" w:hAnsi="Arial"/>
+          <w:rFonts w:ascii="Arial" w:hAnsi="Arial" w:eastAsia="ＭＳ 明朝" w:cs="Arial" w:eastAsiaTheme="minorEastAsia" w:csTheme="minorBidi"/>
           <w:b/>
+          <w:bCs/>
           <w:color w:val="0066CC"/>
           <w:sz w:val="26"/>
+          <w:szCs w:val="22"/>
         </w:rPr>
         <w:t>5. Eventos e Passagem de Funções (Callbacks)</w:t>
       </w:r>
@@ -162,6 +329,11 @@
         <w:spacing w:after="160"/>
       </w:pPr>
       <w:r>
+        <w:rPr>
+          <w:rFonts w:ascii="Cambria" w:hAnsi="Cambria" w:eastAsia="ＭＳ 明朝" w:cs="Cambria" w:asciiTheme="minorHAnsi" w:hAnsiTheme="minorHAnsi" w:eastAsiaTheme="minorEastAsia" w:csTheme="minorBidi"/>
+          <w:sz w:val="22"/>
+          <w:szCs w:val="22"/>
+        </w:rPr>
         <w:t>O evento onClick foi conectado aos botões de filtro e compra. A comunicação do filho para o pai ocorre passando funções como props (ex: adicionarCarrinho é declarada no App e disparada no ProductCard).</w:t>
       </w:r>
     </w:p>
@@ -171,10 +343,12 @@
       </w:pPr>
       <w:r>
         <w:rPr>
-          <w:rFonts w:ascii="Arial" w:hAnsi="Arial"/>
+          <w:rFonts w:ascii="Arial" w:hAnsi="Arial" w:eastAsia="ＭＳ 明朝" w:cs="Arial" w:eastAsiaTheme="minorEastAsia" w:csTheme="minorBidi"/>
           <w:b/>
+          <w:bCs/>
           <w:color w:val="0066CC"/>
           <w:sz w:val="26"/>
+          <w:szCs w:val="22"/>
         </w:rPr>
         <w:t>6. Filtragem de Dados com .filter()</w:t>
       </w:r>
@@ -184,6 +358,11 @@
         <w:spacing w:after="160"/>
       </w:pPr>
       <w:r>
+        <w:rPr>
+          <w:rFonts w:ascii="Cambria" w:hAnsi="Cambria" w:eastAsia="ＭＳ 明朝" w:cs="Cambria" w:asciiTheme="minorHAnsi" w:hAnsiTheme="minorHAnsi" w:eastAsiaTheme="minorEastAsia" w:csTheme="minorBidi"/>
+          <w:sz w:val="22"/>
+          <w:szCs w:val="22"/>
+        </w:rPr>
         <w:t>O método Array.filter() permite calcular dinamicamente a lista de produtos exibida com base na categoria ativa selecionada pelo usuário.</w:t>
       </w:r>
     </w:p>
@@ -193,10 +372,12 @@
       </w:pPr>
       <w:r>
         <w:rPr>
-          <w:rFonts w:ascii="Arial" w:hAnsi="Arial"/>
+          <w:rFonts w:ascii="Arial" w:hAnsi="Arial" w:eastAsia="ＭＳ 明朝" w:cs="Arial" w:eastAsiaTheme="minorEastAsia" w:csTheme="minorBidi"/>
           <w:b/>
+          <w:bCs/>
           <w:color w:val="0066CC"/>
           <w:sz w:val="26"/>
+          <w:szCs w:val="22"/>
         </w:rPr>
         <w:t>7. Renderização Condicional</w:t>
       </w:r>
@@ -206,10 +387,33 @@
         <w:spacing w:after="160"/>
       </w:pPr>
       <w:r>
+        <w:rPr>
+          <w:rFonts w:ascii="Cambria" w:hAnsi="Cambria" w:eastAsia="ＭＳ 明朝" w:cs="Cambria" w:asciiTheme="minorHAnsi" w:hAnsiTheme="minorHAnsi" w:eastAsiaTheme="minorEastAsia" w:csTheme="minorBidi"/>
+          <w:sz w:val="22"/>
+          <w:szCs w:val="22"/>
+        </w:rPr>
         <w:t>Uso de operadores ternários para adaptar a interface conforme o estado atual:</w:t>
-        <w:br/>
+      </w:r>
+      <w:r>
+        <w:br w:type="textWrapping"/>
+      </w:r>
+      <w:r>
+        <w:rPr>
+          <w:rFonts w:ascii="Cambria" w:hAnsi="Cambria" w:eastAsia="ＭＳ 明朝" w:cs="Cambria" w:asciiTheme="minorHAnsi" w:hAnsiTheme="minorHAnsi" w:eastAsiaTheme="minorEastAsia" w:csTheme="minorBidi"/>
+          <w:sz w:val="22"/>
+          <w:szCs w:val="22"/>
+        </w:rPr>
         <w:t>• Exibição da lista de produtos filtrados ou aviso de 'Nenhum produto encontrado'.</w:t>
-        <w:br/>
+      </w:r>
+      <w:r>
+        <w:br w:type="textWrapping"/>
+      </w:r>
+      <w:r>
+        <w:rPr>
+          <w:rFonts w:ascii="Cambria" w:hAnsi="Cambria" w:eastAsia="ＭＳ 明朝" w:cs="Cambria" w:asciiTheme="minorHAnsi" w:hAnsiTheme="minorHAnsi" w:eastAsiaTheme="minorEastAsia" w:csTheme="minorBidi"/>
+          <w:sz w:val="22"/>
+          <w:szCs w:val="22"/>
+        </w:rPr>
         <w:t>• Exibição dos itens no carrinho ou mensagem de 'Seu carrinho está vazio'.</w:t>
       </w:r>
     </w:p>
@@ -219,10 +423,12 @@
       </w:pPr>
       <w:r>
         <w:rPr>
-          <w:rFonts w:ascii="Arial" w:hAnsi="Arial"/>
+          <w:rFonts w:ascii="Arial" w:hAnsi="Arial" w:eastAsia="ＭＳ 明朝" w:cs="Arial" w:eastAsiaTheme="minorEastAsia" w:csTheme="minorBidi"/>
           <w:b/>
+          <w:bCs/>
           <w:color w:val="0066CC"/>
           <w:sz w:val="26"/>
+          <w:szCs w:val="22"/>
         </w:rPr>
         <w:t>8. Estilização Moderna com CSS</w:t>
       </w:r>
@@ -232,6 +438,11 @@
         <w:spacing w:after="160"/>
       </w:pPr>
       <w:r>
+        <w:rPr>
+          <w:rFonts w:ascii="Cambria" w:hAnsi="Cambria" w:eastAsia="ＭＳ 明朝" w:cs="Cambria" w:asciiTheme="minorHAnsi" w:hAnsiTheme="minorHAnsi" w:eastAsiaTheme="minorEastAsia" w:csTheme="minorBidi"/>
+          <w:sz w:val="22"/>
+          <w:szCs w:val="22"/>
+        </w:rPr>
         <w:t>Aplicação de CSS moderno com Flexbox para cabeçalho, categorias e filtros, além de CSS Grid com auto-fit/minmax para a galeria de produtos responsiva.</w:t>
       </w:r>
     </w:p>
@@ -241,19 +452,27 @@
       </w:pPr>
       <w:r>
         <w:rPr>
-          <w:rFonts w:ascii="Arial" w:hAnsi="Arial"/>
+          <w:rFonts w:ascii="Arial" w:hAnsi="Arial" w:eastAsia="ＭＳ 明朝" w:cs="Arial" w:eastAsiaTheme="minorEastAsia" w:csTheme="minorBidi"/>
           <w:b/>
+          <w:bCs/>
           <w:color w:val="111827"/>
           <w:sz w:val="28"/>
+          <w:szCs w:val="22"/>
         </w:rPr>
         <w:t>Síntese dos Conceitos</w:t>
       </w:r>
     </w:p>
     <w:tbl>
       <w:tblPr>
-        <w:tblW w:type="auto" w:w="0"/>
+        <w:tblW w:w="0" w:type="auto"/>
         <w:jc w:val="center"/>
-        <w:tblLook w:firstColumn="1" w:firstRow="1" w:lastColumn="0" w:lastRow="0" w:noHBand="0" w:noVBand="1" w:val="04A0"/>
+        <w:tblCellMar>
+          <w:top w:w="0" w:type="dxa"/>
+          <w:left w:w="108" w:type="dxa"/>
+          <w:bottom w:w="0" w:type="dxa"/>
+          <w:right w:w="108" w:type="dxa"/>
+        </w:tblCellMar>
+        <w:tblLook w:firstRow="1" w:firstColumn="1" w:noVBand="1"/>
       </w:tblPr>
       <w:tblGrid>
         <w:gridCol w:w="4680"/>
@@ -262,16 +481,27 @@
       <w:tr>
         <w:tc>
           <w:tcPr>
-            <w:tcW w:type="dxa" w:w="4680"/>
-            <w:shd w:fill="1E293B"/>
+            <w:tcW w:w="4680" w:type="dxa"/>
+            <w:shd w:val="clear" w:fill="1E293B"/>
+            <w:tcMar>
+              <w:top w:w="0" w:type="dxa"/>
+              <w:left w:w="108" w:type="dxa"/>
+              <w:bottom w:w="0" w:type="dxa"/>
+              <w:right w:w="108" w:type="dxa"/>
+            </w:tcMar>
           </w:tcPr>
           <w:p>
+            <w:pPr>
+              <w:spacing w:after="200" w:line="276" w:lineRule="auto"/>
+            </w:pPr>
             <w:r>
               <w:rPr>
-                <w:rFonts w:ascii="Arial" w:hAnsi="Arial"/>
+                <w:rFonts w:ascii="Arial" w:hAnsi="Arial" w:eastAsia="ＭＳ 明朝" w:cs="Arial" w:eastAsiaTheme="minorEastAsia" w:csTheme="minorBidi"/>
                 <w:b/>
+                <w:bCs/>
                 <w:color w:val="FFFFFF"/>
                 <w:sz w:val="19"/>
+                <w:szCs w:val="22"/>
               </w:rPr>
               <w:t>Conceito</w:t>
             </w:r>
@@ -279,16 +509,27 @@
         </w:tc>
         <w:tc>
           <w:tcPr>
-            <w:tcW w:type="dxa" w:w="4680"/>
-            <w:shd w:fill="1E293B"/>
+            <w:tcW w:w="4680" w:type="dxa"/>
+            <w:shd w:val="clear" w:fill="1E293B"/>
+            <w:tcMar>
+              <w:top w:w="0" w:type="dxa"/>
+              <w:left w:w="108" w:type="dxa"/>
+              <w:bottom w:w="0" w:type="dxa"/>
+              <w:right w:w="108" w:type="dxa"/>
+            </w:tcMar>
           </w:tcPr>
           <w:p>
+            <w:pPr>
+              <w:spacing w:after="200" w:line="276" w:lineRule="auto"/>
+            </w:pPr>
             <w:r>
               <w:rPr>
-                <w:rFonts w:ascii="Arial" w:hAnsi="Arial"/>
+                <w:rFonts w:ascii="Arial" w:hAnsi="Arial" w:eastAsia="ＭＳ 明朝" w:cs="Arial" w:eastAsiaTheme="minorEastAsia" w:csTheme="minorBidi"/>
                 <w:b/>
+                <w:bCs/>
                 <w:color w:val="FFFFFF"/>
                 <w:sz w:val="19"/>
+                <w:szCs w:val="22"/>
               </w:rPr>
               <w:t>Aplicação Prática no Projeto</w:t>
             </w:r>
@@ -298,14 +539,24 @@
       <w:tr>
         <w:tc>
           <w:tcPr>
-            <w:tcW w:type="dxa" w:w="4680"/>
-            <w:shd w:fill="F8FAFC"/>
+            <w:tcW w:w="4680" w:type="dxa"/>
+            <w:shd w:val="clear" w:fill="F8FAFC"/>
+            <w:tcMar>
+              <w:top w:w="0" w:type="dxa"/>
+              <w:left w:w="108" w:type="dxa"/>
+              <w:bottom w:w="0" w:type="dxa"/>
+              <w:right w:w="108" w:type="dxa"/>
+            </w:tcMar>
           </w:tcPr>
           <w:p>
+            <w:pPr>
+              <w:spacing w:after="200" w:line="276" w:lineRule="auto"/>
+            </w:pPr>
             <w:r>
               <w:rPr>
-                <w:rFonts w:ascii="Arial" w:hAnsi="Arial"/>
+                <w:rFonts w:ascii="Arial" w:hAnsi="Arial" w:eastAsia="ＭＳ 明朝" w:cs="Arial" w:eastAsiaTheme="minorEastAsia" w:csTheme="minorBidi"/>
                 <w:sz w:val="19"/>
+                <w:szCs w:val="22"/>
               </w:rPr>
               <w:t>JSX &amp; Componentes</w:t>
             </w:r>
@@ -313,14 +564,24 @@
         </w:tc>
         <w:tc>
           <w:tcPr>
-            <w:tcW w:type="dxa" w:w="4680"/>
-            <w:shd w:fill="F8FAFC"/>
+            <w:tcW w:w="4680" w:type="dxa"/>
+            <w:shd w:val="clear" w:fill="F8FAFC"/>
+            <w:tcMar>
+              <w:top w:w="0" w:type="dxa"/>
+              <w:left w:w="108" w:type="dxa"/>
+              <w:bottom w:w="0" w:type="dxa"/>
+              <w:right w:w="108" w:type="dxa"/>
+            </w:tcMar>
           </w:tcPr>
           <w:p>
+            <w:pPr>
+              <w:spacing w:after="200" w:line="276" w:lineRule="auto"/>
+            </w:pPr>
             <w:r>
               <w:rPr>
-                <w:rFonts w:ascii="Arial" w:hAnsi="Arial"/>
+                <w:rFonts w:ascii="Arial" w:hAnsi="Arial" w:eastAsia="ＭＳ 明朝" w:cs="Arial" w:eastAsiaTheme="minorEastAsia" w:csTheme="minorBidi"/>
                 <w:sz w:val="19"/>
+                <w:szCs w:val="22"/>
               </w:rPr>
               <w:t>Estruturação modular de Header, Hero, ProductCard, Cart e Footer</w:t>
             </w:r>
@@ -330,13 +591,23 @@
       <w:tr>
         <w:tc>
           <w:tcPr>
-            <w:tcW w:type="dxa" w:w="4680"/>
+            <w:tcW w:w="4680" w:type="dxa"/>
+            <w:tcMar>
+              <w:top w:w="0" w:type="dxa"/>
+              <w:left w:w="108" w:type="dxa"/>
+              <w:bottom w:w="0" w:type="dxa"/>
+              <w:right w:w="108" w:type="dxa"/>
+            </w:tcMar>
           </w:tcPr>
           <w:p>
+            <w:pPr>
+              <w:spacing w:after="200" w:line="276" w:lineRule="auto"/>
+            </w:pPr>
             <w:r>
               <w:rPr>
-                <w:rFonts w:ascii="Arial" w:hAnsi="Arial"/>
+                <w:rFonts w:ascii="Arial" w:hAnsi="Arial" w:eastAsia="ＭＳ 明朝" w:cs="Arial" w:eastAsiaTheme="minorEastAsia" w:csTheme="minorBidi"/>
                 <w:sz w:val="19"/>
+                <w:szCs w:val="22"/>
               </w:rPr>
               <w:t>Props &amp; Desestruturação</w:t>
             </w:r>
@@ -344,13 +615,23 @@
         </w:tc>
         <w:tc>
           <w:tcPr>
-            <w:tcW w:type="dxa" w:w="4680"/>
+            <w:tcW w:w="4680" w:type="dxa"/>
+            <w:tcMar>
+              <w:top w:w="0" w:type="dxa"/>
+              <w:left w:w="108" w:type="dxa"/>
+              <w:bottom w:w="0" w:type="dxa"/>
+              <w:right w:w="108" w:type="dxa"/>
+            </w:tcMar>
           </w:tcPr>
           <w:p>
+            <w:pPr>
+              <w:spacing w:after="200" w:line="276" w:lineRule="auto"/>
+            </w:pPr>
             <w:r>
               <w:rPr>
-                <w:rFonts w:ascii="Arial" w:hAnsi="Arial"/>
+                <w:rFonts w:ascii="Arial" w:hAnsi="Arial" w:eastAsia="ＭＳ 明朝" w:cs="Arial" w:eastAsiaTheme="minorEastAsia" w:csTheme="minorBidi"/>
                 <w:sz w:val="19"/>
+                <w:szCs w:val="22"/>
               </w:rPr>
               <w:t>Envio e extração limpa de dados para componentes filhos</w:t>
             </w:r>
@@ -360,14 +641,24 @@
       <w:tr>
         <w:tc>
           <w:tcPr>
-            <w:tcW w:type="dxa" w:w="4680"/>
-            <w:shd w:fill="F8FAFC"/>
+            <w:tcW w:w="4680" w:type="dxa"/>
+            <w:shd w:val="clear" w:fill="F8FAFC"/>
+            <w:tcMar>
+              <w:top w:w="0" w:type="dxa"/>
+              <w:left w:w="108" w:type="dxa"/>
+              <w:bottom w:w="0" w:type="dxa"/>
+              <w:right w:w="108" w:type="dxa"/>
+            </w:tcMar>
           </w:tcPr>
           <w:p>
+            <w:pPr>
+              <w:spacing w:after="200" w:line="276" w:lineRule="auto"/>
+            </w:pPr>
             <w:r>
               <w:rPr>
-                <w:rFonts w:ascii="Arial" w:hAnsi="Arial"/>
+                <w:rFonts w:ascii="Arial" w:hAnsi="Arial" w:eastAsia="ＭＳ 明朝" w:cs="Arial" w:eastAsiaTheme="minorEastAsia" w:csTheme="minorBidi"/>
                 <w:sz w:val="19"/>
+                <w:szCs w:val="22"/>
               </w:rPr>
               <w:t>Eventos (onClick)</w:t>
             </w:r>
@@ -375,14 +666,24 @@
         </w:tc>
         <w:tc>
           <w:tcPr>
-            <w:tcW w:type="dxa" w:w="4680"/>
-            <w:shd w:fill="F8FAFC"/>
+            <w:tcW w:w="4680" w:type="dxa"/>
+            <w:shd w:val="clear" w:fill="F8FAFC"/>
+            <w:tcMar>
+              <w:top w:w="0" w:type="dxa"/>
+              <w:left w:w="108" w:type="dxa"/>
+              <w:bottom w:w="0" w:type="dxa"/>
+              <w:right w:w="108" w:type="dxa"/>
+            </w:tcMar>
           </w:tcPr>
           <w:p>
+            <w:pPr>
+              <w:spacing w:after="200" w:line="276" w:lineRule="auto"/>
+            </w:pPr>
             <w:r>
               <w:rPr>
-                <w:rFonts w:ascii="Arial" w:hAnsi="Arial"/>
+                <w:rFonts w:ascii="Arial" w:hAnsi="Arial" w:eastAsia="ＭＳ 明朝" w:cs="Arial" w:eastAsiaTheme="minorEastAsia" w:csTheme="minorBidi"/>
                 <w:sz w:val="19"/>
+                <w:szCs w:val="22"/>
               </w:rPr>
               <w:t>Disparo de ações nos botões de filtro e compra</w:t>
             </w:r>
@@ -392,13 +693,23 @@
       <w:tr>
         <w:tc>
           <w:tcPr>
-            <w:tcW w:type="dxa" w:w="4680"/>
+            <w:tcW w:w="4680" w:type="dxa"/>
+            <w:tcMar>
+              <w:top w:w="0" w:type="dxa"/>
+              <w:left w:w="108" w:type="dxa"/>
+              <w:bottom w:w="0" w:type="dxa"/>
+              <w:right w:w="108" w:type="dxa"/>
+            </w:tcMar>
           </w:tcPr>
           <w:p>
+            <w:pPr>
+              <w:spacing w:after="200" w:line="276" w:lineRule="auto"/>
+            </w:pPr>
             <w:r>
               <w:rPr>
-                <w:rFonts w:ascii="Arial" w:hAnsi="Arial"/>
+                <w:rFonts w:ascii="Arial" w:hAnsi="Arial" w:eastAsia="ＭＳ 明朝" w:cs="Arial" w:eastAsiaTheme="minorEastAsia" w:csTheme="minorBidi"/>
                 <w:sz w:val="19"/>
+                <w:szCs w:val="22"/>
               </w:rPr>
               <w:t>useState</w:t>
             </w:r>
@@ -406,13 +717,23 @@
         </w:tc>
         <w:tc>
           <w:tcPr>
-            <w:tcW w:type="dxa" w:w="4680"/>
+            <w:tcW w:w="4680" w:type="dxa"/>
+            <w:tcMar>
+              <w:top w:w="0" w:type="dxa"/>
+              <w:left w:w="108" w:type="dxa"/>
+              <w:bottom w:w="0" w:type="dxa"/>
+              <w:right w:w="108" w:type="dxa"/>
+            </w:tcMar>
           </w:tcPr>
           <w:p>
+            <w:pPr>
+              <w:spacing w:after="200" w:line="276" w:lineRule="auto"/>
+            </w:pPr>
             <w:r>
               <w:rPr>
-                <w:rFonts w:ascii="Arial" w:hAnsi="Arial"/>
+                <w:rFonts w:ascii="Arial" w:hAnsi="Arial" w:eastAsia="ＭＳ 明朝" w:cs="Arial" w:eastAsiaTheme="minorEastAsia" w:csTheme="minorBidi"/>
                 <w:sz w:val="19"/>
+                <w:szCs w:val="22"/>
               </w:rPr>
               <w:t>Armazenamento da categoria ativa e do carrinho de compras</w:t>
             </w:r>
@@ -422,14 +743,24 @@
       <w:tr>
         <w:tc>
           <w:tcPr>
-            <w:tcW w:type="dxa" w:w="4680"/>
-            <w:shd w:fill="F8FAFC"/>
+            <w:tcW w:w="4680" w:type="dxa"/>
+            <w:shd w:val="clear" w:fill="F8FAFC"/>
+            <w:tcMar>
+              <w:top w:w="0" w:type="dxa"/>
+              <w:left w:w="108" w:type="dxa"/>
+              <w:bottom w:w="0" w:type="dxa"/>
+              <w:right w:w="108" w:type="dxa"/>
+            </w:tcMar>
           </w:tcPr>
           <w:p>
+            <w:pPr>
+              <w:spacing w:after="200" w:line="276" w:lineRule="auto"/>
+            </w:pPr>
             <w:r>
               <w:rPr>
-                <w:rFonts w:ascii="Arial" w:hAnsi="Arial"/>
+                <w:rFonts w:ascii="Arial" w:hAnsi="Arial" w:eastAsia="ＭＳ 明朝" w:cs="Arial" w:eastAsiaTheme="minorEastAsia" w:csTheme="minorBidi"/>
                 <w:sz w:val="19"/>
+                <w:szCs w:val="22"/>
               </w:rPr>
               <w:t>.map() e .filter()</w:t>
             </w:r>
@@ -437,14 +768,24 @@
         </w:tc>
         <w:tc>
           <w:tcPr>
-            <w:tcW w:type="dxa" w:w="4680"/>
-            <w:shd w:fill="F8FAFC"/>
+            <w:tcW w:w="4680" w:type="dxa"/>
+            <w:shd w:val="clear" w:fill="F8FAFC"/>
+            <w:tcMar>
+              <w:top w:w="0" w:type="dxa"/>
+              <w:left w:w="108" w:type="dxa"/>
+              <w:bottom w:w="0" w:type="dxa"/>
+              <w:right w:w="108" w:type="dxa"/>
+            </w:tcMar>
           </w:tcPr>
           <w:p>
+            <w:pPr>
+              <w:spacing w:after="200" w:line="276" w:lineRule="auto"/>
+            </w:pPr>
             <w:r>
               <w:rPr>
-                <w:rFonts w:ascii="Arial" w:hAnsi="Arial"/>
+                <w:rFonts w:ascii="Arial" w:hAnsi="Arial" w:eastAsia="ＭＳ 明朝" w:cs="Arial" w:eastAsiaTheme="minorEastAsia" w:csTheme="minorBidi"/>
                 <w:sz w:val="19"/>
+                <w:szCs w:val="22"/>
               </w:rPr>
               <w:t>Listagem iterativa e filtragem dinâmica dos produtos</w:t>
             </w:r>
@@ -454,13 +795,23 @@
       <w:tr>
         <w:tc>
           <w:tcPr>
-            <w:tcW w:type="dxa" w:w="4680"/>
+            <w:tcW w:w="4680" w:type="dxa"/>
+            <w:tcMar>
+              <w:top w:w="0" w:type="dxa"/>
+              <w:left w:w="108" w:type="dxa"/>
+              <w:bottom w:w="0" w:type="dxa"/>
+              <w:right w:w="108" w:type="dxa"/>
+            </w:tcMar>
           </w:tcPr>
           <w:p>
+            <w:pPr>
+              <w:spacing w:after="200" w:line="276" w:lineRule="auto"/>
+            </w:pPr>
             <w:r>
               <w:rPr>
-                <w:rFonts w:ascii="Arial" w:hAnsi="Arial"/>
+                <w:rFonts w:ascii="Arial" w:hAnsi="Arial" w:eastAsia="ＭＳ 明朝" w:cs="Arial" w:eastAsiaTheme="minorEastAsia" w:csTheme="minorBidi"/>
                 <w:sz w:val="19"/>
+                <w:szCs w:val="22"/>
               </w:rPr>
               <w:t>Renderização Condicional</w:t>
             </w:r>
@@ -468,13 +819,23 @@
         </w:tc>
         <w:tc>
           <w:tcPr>
-            <w:tcW w:type="dxa" w:w="4680"/>
+            <w:tcW w:w="4680" w:type="dxa"/>
+            <w:tcMar>
+              <w:top w:w="0" w:type="dxa"/>
+              <w:left w:w="108" w:type="dxa"/>
+              <w:bottom w:w="0" w:type="dxa"/>
+              <w:right w:w="108" w:type="dxa"/>
+            </w:tcMar>
           </w:tcPr>
           <w:p>
+            <w:pPr>
+              <w:spacing w:after="200" w:line="276" w:lineRule="auto"/>
+            </w:pPr>
             <w:r>
               <w:rPr>
-                <w:rFonts w:ascii="Arial" w:hAnsi="Arial"/>
+                <w:rFonts w:ascii="Arial" w:hAnsi="Arial" w:eastAsia="ＭＳ 明朝" w:cs="Arial" w:eastAsiaTheme="minorEastAsia" w:csTheme="minorBidi"/>
                 <w:sz w:val="19"/>
+                <w:szCs w:val="22"/>
               </w:rPr>
               <w:t>Feedback visual em listas vazias e carrinho vazio</w:t>
             </w:r>
@@ -484,14 +845,24 @@
       <w:tr>
         <w:tc>
           <w:tcPr>
-            <w:tcW w:type="dxa" w:w="4680"/>
-            <w:shd w:fill="F8FAFC"/>
+            <w:tcW w:w="4680" w:type="dxa"/>
+            <w:shd w:val="clear" w:fill="F8FAFC"/>
+            <w:tcMar>
+              <w:top w:w="0" w:type="dxa"/>
+              <w:left w:w="108" w:type="dxa"/>
+              <w:bottom w:w="0" w:type="dxa"/>
+              <w:right w:w="108" w:type="dxa"/>
+            </w:tcMar>
           </w:tcPr>
           <w:p>
+            <w:pPr>
+              <w:spacing w:after="200" w:line="276" w:lineRule="auto"/>
+            </w:pPr>
             <w:r>
               <w:rPr>
-                <w:rFonts w:ascii="Arial" w:hAnsi="Arial"/>
+                <w:rFonts w:ascii="Arial" w:hAnsi="Arial" w:eastAsia="ＭＳ 明朝" w:cs="Arial" w:eastAsiaTheme="minorEastAsia" w:csTheme="minorBidi"/>
                 <w:sz w:val="19"/>
+                <w:szCs w:val="22"/>
               </w:rPr>
               <w:t>CSS Grid &amp; Flexbox</w:t>
             </w:r>
@@ -499,14 +870,24 @@
         </w:tc>
         <w:tc>
           <w:tcPr>
-            <w:tcW w:type="dxa" w:w="4680"/>
-            <w:shd w:fill="F8FAFC"/>
+            <w:tcW w:w="4680" w:type="dxa"/>
+            <w:shd w:val="clear" w:fill="F8FAFC"/>
+            <w:tcMar>
+              <w:top w:w="0" w:type="dxa"/>
+              <w:left w:w="108" w:type="dxa"/>
+              <w:bottom w:w="0" w:type="dxa"/>
+              <w:right w:w="108" w:type="dxa"/>
+            </w:tcMar>
           </w:tcPr>
           <w:p>
+            <w:pPr>
+              <w:spacing w:after="200" w:line="276" w:lineRule="auto"/>
+            </w:pPr>
             <w:r>
               <w:rPr>
-                <w:rFonts w:ascii="Arial" w:hAnsi="Arial"/>
+                <w:rFonts w:ascii="Arial" w:hAnsi="Arial" w:eastAsia="ＭＳ 明朝" w:cs="Arial" w:eastAsiaTheme="minorEastAsia" w:csTheme="minorBidi"/>
                 <w:sz w:val="19"/>
+                <w:szCs w:val="22"/>
               </w:rPr>
               <w:t>Organização de layout profissional, fluido e responsivo</w:t>
             </w:r>
@@ -514,10 +895,10 @@
         </w:tc>
       </w:tr>
     </w:tbl>
+    <w:p/>
     <w:sectPr>
       <w:pgSz w:w="12240" w:h="15840"/>
       <w:pgMar w:top="1440" w:right="1440" w:bottom="1440" w:left="1440" w:header="720" w:footer="720" w:gutter="0"/>
-      <w:cols w:space="720"/>
       <w:docGrid w:linePitch="360"/>
     </w:sectPr>
   </w:body>

</xml_diff>